<commit_message>
Update global summary prompt and config settings
</commit_message>
<xml_diff>
--- a/output/summary_report.docx
+++ b/output/summary_report.docx
@@ -33,7 +33,7 @@
         <w:t xml:space="preserve">Task: </w:t>
       </w:r>
       <w:r>
-        <w:t>Summarize all documents and extract key information regarding coputer organization and architecture</w:t>
+        <w:t>Summarize all documents and extract key information.</w:t>
       </w:r>
     </w:p>
     <w:p>
@@ -173,14 +173,181 @@
               <w:rPr>
                 <w:b/>
               </w:rPr>
-              <w:t>ARM.pdf</w:t>
+              <w:t>MCQ Constitution of India.pdf</w:t>
             </w:r>
             <w:r>
               <w:rPr>
                 <w:i/>
               </w:rPr>
               <w:br/>
-              <w:t>.pdf  ·  849.89 KB</w:t>
+              <w:t>.pdf  ·  4850.96 KB</w:t>
+            </w:r>
+          </w:p>
+        </w:tc>
+        <w:tc>
+          <w:tcPr>
+            <w:tcW w:type="dxa" w:w="2160"/>
+          </w:tcPr>
+          <w:p>
+            <w:r>
+              <w:t>The file contains a series of blank pages scanned using CamScanner.</w:t>
+            </w:r>
+          </w:p>
+        </w:tc>
+        <w:tc>
+          <w:tcPr>
+            <w:tcW w:type="dxa" w:w="2160"/>
+          </w:tcPr>
+          <w:p>
+            <w:r/>
+            <w:r>
+              <w:t>—</w:t>
+            </w:r>
+          </w:p>
+        </w:tc>
+        <w:tc>
+          <w:tcPr>
+            <w:tcW w:type="dxa" w:w="2160"/>
+          </w:tcPr>
+          <w:p>
+            <w:r>
+              <w:t>—</w:t>
+            </w:r>
+          </w:p>
+        </w:tc>
+      </w:tr>
+      <w:tr>
+        <w:tc>
+          <w:tcPr>
+            <w:tcW w:type="dxa" w:w="2160"/>
+          </w:tcPr>
+          <w:p>
+            <w:r/>
+            <w:r>
+              <w:rPr>
+                <w:b/>
+              </w:rPr>
+              <w:t>prefinal 1 Constitution of India-1.pdf</w:t>
+            </w:r>
+            <w:r>
+              <w:rPr>
+                <w:i/>
+              </w:rPr>
+              <w:br/>
+              <w:t>.pdf  ·  8707.74 KB</w:t>
+            </w:r>
+          </w:p>
+        </w:tc>
+        <w:tc>
+          <w:tcPr>
+            <w:tcW w:type="dxa" w:w="2160"/>
+          </w:tcPr>
+          <w:p>
+            <w:r>
+              <w:t>The file contains a series of blank pages with the CamScanner logo.</w:t>
+            </w:r>
+          </w:p>
+        </w:tc>
+        <w:tc>
+          <w:tcPr>
+            <w:tcW w:type="dxa" w:w="2160"/>
+          </w:tcPr>
+          <w:p>
+            <w:r/>
+            <w:r>
+              <w:t>—</w:t>
+            </w:r>
+          </w:p>
+        </w:tc>
+        <w:tc>
+          <w:tcPr>
+            <w:tcW w:type="dxa" w:w="2160"/>
+          </w:tcPr>
+          <w:p>
+            <w:r>
+              <w:t>—</w:t>
+            </w:r>
+          </w:p>
+        </w:tc>
+      </w:tr>
+      <w:tr>
+        <w:tc>
+          <w:tcPr>
+            <w:tcW w:type="dxa" w:w="2160"/>
+          </w:tcPr>
+          <w:p>
+            <w:r/>
+            <w:r>
+              <w:rPr>
+                <w:b/>
+              </w:rPr>
+              <w:t>Screenshot 2025-01-07 184655.png</w:t>
+            </w:r>
+            <w:r>
+              <w:rPr>
+                <w:i/>
+              </w:rPr>
+              <w:br/>
+              <w:t>.png  ·  344.86 KB</w:t>
+            </w:r>
+          </w:p>
+        </w:tc>
+        <w:tc>
+          <w:tcPr>
+            <w:tcW w:type="dxa" w:w="2160"/>
+          </w:tcPr>
+          <w:p>
+            <w:r>
+              <w:t>The image contains a document with text, which seems to be related to an examination or test in India. The document includes a title, a subtitle, and some body text. It also has a table with numerical values and descriptions of the items being evaluated.</w:t>
+            </w:r>
+          </w:p>
+        </w:tc>
+        <w:tc>
+          <w:tcPr>
+            <w:tcW w:type="dxa" w:w="2160"/>
+          </w:tcPr>
+          <w:p>
+            <w:r/>
+            <w:r>
+              <w:t>• The document is about an examination in India.</w:t>
+            </w:r>
+          </w:p>
+          <w:p>
+            <w:r>
+              <w:t>• There are numerical values and descriptions of the items being evaluated.</w:t>
+            </w:r>
+          </w:p>
+        </w:tc>
+        <w:tc>
+          <w:tcPr>
+            <w:tcW w:type="dxa" w:w="2160"/>
+          </w:tcPr>
+          <w:p>
+            <w:r>
+              <w:t>India, examination</w:t>
+            </w:r>
+          </w:p>
+        </w:tc>
+      </w:tr>
+      <w:tr>
+        <w:tc>
+          <w:tcPr>
+            <w:tcW w:type="dxa" w:w="2160"/>
+          </w:tcPr>
+          <w:p>
+            <w:r/>
+            <w:r>
+              <w:rPr>
+                <w:b/>
+              </w:rPr>
+              <w:t>Screenshot 2025-01-07 184705.png</w:t>
+            </w:r>
+            <w:r>
+              <w:rPr>
+                <w:i/>
+              </w:rPr>
+              <w:br/>
+              <w:t>.png  ·  145.06 KB</w:t>
             </w:r>
           </w:p>
         </w:tc>
@@ -227,14 +394,14 @@
               <w:rPr>
                 <w:b/>
               </w:rPr>
-              <w:t>cpu-structure-and-function.pdf</w:t>
+              <w:t>syllb and notes.pdf</w:t>
             </w:r>
             <w:r>
               <w:rPr>
                 <w:i/>
               </w:rPr>
               <w:br/>
-              <w:t>.pdf  ·  421.2 KB</w:t>
+              <w:t>.pdf  ·  6738.71 KB</w:t>
             </w:r>
           </w:p>
         </w:tc>
@@ -244,169 +411,7 @@
           </w:tcPr>
           <w:p>
             <w:r>
-              <w:t>—</w:t>
-            </w:r>
-          </w:p>
-        </w:tc>
-        <w:tc>
-          <w:tcPr>
-            <w:tcW w:type="dxa" w:w="2160"/>
-          </w:tcPr>
-          <w:p>
-            <w:r/>
-            <w:r>
-              <w:t>—</w:t>
-            </w:r>
-          </w:p>
-        </w:tc>
-        <w:tc>
-          <w:tcPr>
-            <w:tcW w:type="dxa" w:w="2160"/>
-          </w:tcPr>
-          <w:p>
-            <w:r>
-              <w:t>—</w:t>
-            </w:r>
-          </w:p>
-        </w:tc>
-      </w:tr>
-      <w:tr>
-        <w:tc>
-          <w:tcPr>
-            <w:tcW w:type="dxa" w:w="2160"/>
-          </w:tcPr>
-          <w:p>
-            <w:r/>
-            <w:r>
-              <w:rPr>
-                <w:b/>
-              </w:rPr>
-              <w:t>Data flow and instruction cycle.pdf</w:t>
-            </w:r>
-            <w:r>
-              <w:rPr>
-                <w:i/>
-              </w:rPr>
-              <w:br/>
-              <w:t>.pdf  ·  125.19 KB</w:t>
-            </w:r>
-          </w:p>
-        </w:tc>
-        <w:tc>
-          <w:tcPr>
-            <w:tcW w:type="dxa" w:w="2160"/>
-          </w:tcPr>
-          <w:p>
-            <w:r>
-              <w:t>—</w:t>
-            </w:r>
-          </w:p>
-        </w:tc>
-        <w:tc>
-          <w:tcPr>
-            <w:tcW w:type="dxa" w:w="2160"/>
-          </w:tcPr>
-          <w:p>
-            <w:r/>
-            <w:r>
-              <w:t>—</w:t>
-            </w:r>
-          </w:p>
-        </w:tc>
-        <w:tc>
-          <w:tcPr>
-            <w:tcW w:type="dxa" w:w="2160"/>
-          </w:tcPr>
-          <w:p>
-            <w:r>
-              <w:t>—</w:t>
-            </w:r>
-          </w:p>
-        </w:tc>
-      </w:tr>
-      <w:tr>
-        <w:tc>
-          <w:tcPr>
-            <w:tcW w:type="dxa" w:w="2160"/>
-          </w:tcPr>
-          <w:p>
-            <w:r/>
-            <w:r>
-              <w:rPr>
-                <w:b/>
-              </w:rPr>
-              <w:t>Pipelining.pdf</w:t>
-            </w:r>
-            <w:r>
-              <w:rPr>
-                <w:i/>
-              </w:rPr>
-              <w:br/>
-              <w:t>.pdf  ·  1188.68 KB</w:t>
-            </w:r>
-          </w:p>
-        </w:tc>
-        <w:tc>
-          <w:tcPr>
-            <w:tcW w:type="dxa" w:w="2160"/>
-          </w:tcPr>
-          <w:p>
-            <w:r>
-              <w:t>—</w:t>
-            </w:r>
-          </w:p>
-        </w:tc>
-        <w:tc>
-          <w:tcPr>
-            <w:tcW w:type="dxa" w:w="2160"/>
-          </w:tcPr>
-          <w:p>
-            <w:r/>
-            <w:r>
-              <w:t>—</w:t>
-            </w:r>
-          </w:p>
-        </w:tc>
-        <w:tc>
-          <w:tcPr>
-            <w:tcW w:type="dxa" w:w="2160"/>
-          </w:tcPr>
-          <w:p>
-            <w:r>
-              <w:t>—</w:t>
-            </w:r>
-          </w:p>
-        </w:tc>
-      </w:tr>
-      <w:tr>
-        <w:tc>
-          <w:tcPr>
-            <w:tcW w:type="dxa" w:w="2160"/>
-          </w:tcPr>
-          <w:p>
-            <w:r/>
-            <w:r>
-              <w:rPr>
-                <w:b/>
-              </w:rPr>
-              <w:t>Syllabus.png</w:t>
-            </w:r>
-            <w:r>
-              <w:rPr>
-                <w:i/>
-              </w:rPr>
-              <w:br/>
-              <w:t>.png  ·  324.58 KB</w:t>
-            </w:r>
-          </w:p>
-        </w:tc>
-        <w:tc>
-          <w:tcPr>
-            <w:tcW w:type="dxa" w:w="2160"/>
-          </w:tcPr>
-          <w:p>
-            <w:r>
-              <w:t>—</w:t>
+              <w:t>The file contains a series of blank pages scanned using CamScanner.</w:t>
             </w:r>
           </w:p>
         </w:tc>

</xml_diff>